<commit_message>
Change QuickStart QR Code
- Master Branch Relation
</commit_message>
<xml_diff>
--- a/documentation/GitRepo.docx
+++ b/documentation/GitRepo.docx
@@ -9,8 +9,9 @@
           <w:rFonts w:ascii="Verdana" w:hAnsi="Verdana"/>
           <w:b/>
           <w:bCs/>
-          <w:sz w:val="52"/>
-          <w:szCs w:val="52"/>
+          <w:sz w:val="32"/>
+          <w:szCs w:val="32"/>
+          <w:lang w:val="fr-CH"/>
         </w:rPr>
       </w:pPr>
     </w:p>
@@ -55,6 +56,7 @@
           <w:rFonts w:ascii="Verdana" w:hAnsi="Verdana"/>
           <w:b/>
           <w:bCs/>
+          <w:noProof/>
           <w:sz w:val="112"/>
           <w:szCs w:val="112"/>
           <w:lang w:val="fr-CH"/>
@@ -256,10 +258,10 @@
           <w:lang w:val="fr-CH"/>
         </w:rPr>
         <w:drawing>
-          <wp:inline distT="0" distB="0" distL="0" distR="0" wp14:anchorId="13A6850A" wp14:editId="7E766F74">
-            <wp:extent cx="2514600" cy="2534833"/>
+          <wp:inline distT="0" distB="0" distL="0" distR="0" wp14:anchorId="16BBBDCC" wp14:editId="21C898DC">
+            <wp:extent cx="2591868" cy="2595010"/>
             <wp:effectExtent l="0" t="0" r="0" b="0"/>
-            <wp:docPr id="841285257" name="Grafik 1"/>
+            <wp:docPr id="290805627" name="Grafik 1"/>
             <wp:cNvGraphicFramePr>
               <a:graphicFrameLocks xmlns:a="http://schemas.openxmlformats.org/drawingml/2006/main" noChangeAspect="1"/>
             </wp:cNvGraphicFramePr>
@@ -267,7 +269,7 @@
               <a:graphicData uri="http://schemas.openxmlformats.org/drawingml/2006/picture">
                 <pic:pic xmlns:pic="http://schemas.openxmlformats.org/drawingml/2006/picture">
                   <pic:nvPicPr>
-                    <pic:cNvPr id="841285257" name=""/>
+                    <pic:cNvPr id="290805627" name=""/>
                     <pic:cNvPicPr/>
                   </pic:nvPicPr>
                   <pic:blipFill>
@@ -279,7 +281,7 @@
                   <pic:spPr>
                     <a:xfrm>
                       <a:off x="0" y="0"/>
-                      <a:ext cx="2546929" cy="2567422"/>
+                      <a:ext cx="2605855" cy="2609014"/>
                     </a:xfrm>
                     <a:prstGeom prst="rect">
                       <a:avLst/>

</xml_diff>